<commit_message>
Tried improving churn prediction by tun in g the parameters.
</commit_message>
<xml_diff>
--- a/Code_Lowie/Report V1.docx
+++ b/Code_Lowie/Report V1.docx
@@ -538,10 +538,81 @@
     </w:p>
     <w:p>
       <w:pPr>
-        <w:rPr>
-          <w:lang w:val="en-GB"/>
-        </w:rPr>
-      </w:pPr>
+        <w:pStyle w:val="Lijstalinea"/>
+        <w:rPr>
+          <w:lang w:val="en-GB"/>
+        </w:rPr>
+      </w:pPr>
+    </w:p>
+    <w:p>
+      <w:pPr>
+        <w:pStyle w:val="Lijstalinea"/>
+        <w:rPr>
+          <w:lang w:val="en-GB"/>
+        </w:rPr>
+      </w:pPr>
+    </w:p>
+    <w:p>
+      <w:pPr>
+        <w:pStyle w:val="Lijstalinea"/>
+        <w:rPr>
+          <w:lang w:val="en-GB"/>
+        </w:rPr>
+      </w:pPr>
+    </w:p>
+    <w:p>
+      <w:pPr>
+        <w:rPr>
+          <w:u w:val="single"/>
+          <w:lang w:val="en-GB"/>
+        </w:rPr>
+      </w:pPr>
+      <w:r>
+        <w:rPr>
+          <w:u w:val="single"/>
+          <w:lang w:val="en-GB"/>
+        </w:rPr>
+        <w:t>Notebook 3: Parameter tuning</w:t>
+      </w:r>
+      <w:r>
+        <w:rPr>
+          <w:u w:val="single"/>
+          <w:lang w:val="en-GB"/>
+        </w:rPr>
+        <w:t>:</w:t>
+      </w:r>
+    </w:p>
+    <w:p>
+      <w:pPr>
+        <w:rPr>
+          <w:lang w:val="en-GB"/>
+        </w:rPr>
+      </w:pPr>
+      <w:r>
+        <w:rPr>
+          <w:lang w:val="en-GB"/>
+        </w:rPr>
+        <w:t xml:space="preserve">Tried to tune the model parameters to better predict the churning. Didn’t have the expected results yet, will look at this further. </w:t>
+      </w:r>
+    </w:p>
+    <w:p>
+      <w:pPr>
+        <w:rPr>
+          <w:lang w:val="en-GB"/>
+        </w:rPr>
+      </w:pPr>
+      <w:r>
+        <w:rPr>
+          <w:lang w:val="en-GB"/>
+        </w:rPr>
+        <w:sym w:font="Wingdings" w:char="F0E0"/>
+      </w:r>
+      <w:r>
+        <w:rPr>
+          <w:lang w:val="en-GB"/>
+        </w:rPr>
+        <w:t xml:space="preserve"> Results: 62.146 &amp; 0.395</w:t>
+      </w:r>
     </w:p>
     <w:p>
       <w:pPr>
@@ -644,6 +715,39 @@
         </w:rPr>
         <w:t>Fourth attempt = 61.762 &amp; 0.404</w:t>
       </w:r>
+    </w:p>
+    <w:p>
+      <w:pPr>
+        <w:rPr>
+          <w:lang w:val="en-GB"/>
+        </w:rPr>
+      </w:pPr>
+      <w:r>
+        <w:rPr>
+          <w:lang w:val="en-GB"/>
+        </w:rPr>
+        <w:t xml:space="preserve">Fifth attempt = </w:t>
+      </w:r>
+      <w:r>
+        <w:rPr>
+          <w:lang w:val="en-GB"/>
+        </w:rPr>
+        <w:t>62.146 &amp; 0.395</w:t>
+      </w:r>
+    </w:p>
+    <w:p>
+      <w:pPr>
+        <w:rPr>
+          <w:lang w:val="en-GB"/>
+        </w:rPr>
+      </w:pPr>
+    </w:p>
+    <w:p>
+      <w:pPr>
+        <w:rPr>
+          <w:lang w:val="en-GB"/>
+        </w:rPr>
+      </w:pPr>
     </w:p>
     <w:p>
       <w:pPr>

</xml_diff>